<commit_message>
Lab report template update
</commit_message>
<xml_diff>
--- a/docs/NMI_lab_01_Jegyzokonyv_Sablon.docx
+++ b/docs/NMI_lab_01_Jegyzokonyv_Sablon.docx
@@ -1349,7 +1349,15 @@
       </w:r>
       <w:r>
         <w:rPr/>
-        <w:t xml:space="preserve"> Dekódolja a 0x00000210 címen lévő „</w:t>
+        <w:t xml:space="preserve"> Dekódolja a 0x0000021</w:t>
+      </w:r>
+      <w:r>
+        <w:rPr/>
+        <w:t>4</w:t>
+      </w:r>
+      <w:r>
+        <w:rPr/>
+        <w:t xml:space="preserve"> címen lévő „</w:t>
       </w:r>
       <w:r>
         <w:rPr>
@@ -4330,8 +4338,8 @@
         </w:numPr>
         <w:rPr/>
       </w:pPr>
-      <w:bookmarkStart w:id="7" w:name="_Hlk150260599"/>
-      <w:bookmarkStart w:id="8" w:name="_Hlk150357768_Copy_1"/>
+      <w:bookmarkStart w:id="7" w:name="_Hlk150357768_Copy_1"/>
+      <w:bookmarkStart w:id="8" w:name="_Hlk150260599"/>
       <w:bookmarkEnd w:id="7"/>
       <w:bookmarkEnd w:id="8"/>
       <w:r>
@@ -5464,10 +5472,10 @@
           <w:rFonts w:eastAsia="SimSun"/>
         </w:rPr>
       </w:r>
-      <w:bookmarkStart w:id="12" w:name="_Irodalomjegyzék"/>
-      <w:bookmarkStart w:id="13" w:name="_Irodalomjegyzék_1"/>
-      <w:bookmarkStart w:id="14" w:name="_Irodalomjegyzék"/>
-      <w:bookmarkStart w:id="15" w:name="_Irodalomjegyzék_1"/>
+      <w:bookmarkStart w:id="12" w:name="_Irodalomjegyzék_1"/>
+      <w:bookmarkStart w:id="13" w:name="_Irodalomjegyzék"/>
+      <w:bookmarkStart w:id="14" w:name="_Irodalomjegyzék_1"/>
+      <w:bookmarkStart w:id="15" w:name="_Irodalomjegyzék"/>
       <w:bookmarkEnd w:id="14"/>
       <w:bookmarkEnd w:id="15"/>
     </w:p>
@@ -12149,7 +12157,6 @@
   </w:style>
   <w:style w:type="character" w:styleId="FootnoteCharacters">
     <w:name w:val="Footnote Characters"/>
-    <w:basedOn w:val="DefaultParagraphFont"/>
     <w:semiHidden/>
     <w:qFormat/>
     <w:rsid w:val="00004835"/>

</xml_diff>